<commit_message>
Update Communication Management Plan to latest version
Co-Authored-By: Claude Opus 4.6 (1M context) <noreply@anthropic.com>
</commit_message>
<xml_diff>
--- a/docs/documents/planning/Communication Management Plan.docx
+++ b/docs/documents/planning/Communication Management Plan.docx
@@ -21,7 +21,7 @@
           <w:szCs w:val="36"/>
           <w:rtl w:val="0"/>
         </w:rPr>
-        <w:t xml:space="preserve">Communication Management Plan - Version 1.0</w:t>
+        <w:t xml:space="preserve">Communication Management Plan - Version 1.1</w:t>
       </w:r>
       <w:r>
         <w:rPr>
@@ -35,8 +35,8 @@
         <w:jc w:val="center"/>
         <w:rPr>
           <w:rFonts w:ascii="Times New Roman" w:cs="Times New Roman" w:eastAsia="Times New Roman" w:hAnsi="Times New Roman"/>
-          <w:sz w:val="36"/>
-          <w:szCs w:val="36"/>
+          <w:sz w:val="24"/>
+          <w:szCs w:val="24"/>
         </w:rPr>
       </w:pPr>
       <w:r>
@@ -48,23 +48,8 @@
           <w:szCs w:val="36"/>
           <w:rtl w:val="0"/>
         </w:rPr>
-        <w:t xml:space="preserve">Date 2/23/2025</w:t>
-      </w:r>
-      <w:r>
-        <w:rPr>
-          <w:rtl w:val="0"/>
-        </w:rPr>
-      </w:r>
-    </w:p>
-    <w:p>
-      <w:pPr>
-        <w:spacing w:line="240" w:lineRule="auto"/>
-        <w:rPr>
-          <w:rFonts w:ascii="Times New Roman" w:cs="Times New Roman" w:eastAsia="Times New Roman" w:hAnsi="Times New Roman"/>
-          <w:sz w:val="24"/>
-          <w:szCs w:val="24"/>
-        </w:rPr>
-      </w:pPr>
+        <w:t xml:space="preserve">Date 4/19/2026</w:t>
+      </w:r>
       <w:r>
         <w:rPr>
           <w:rtl w:val="0"/>
@@ -331,7 +316,7 @@
     <w:tbl>
       <w:tblPr>
         <w:tblStyle w:val="Table1"/>
-        <w:tblW w:w="8610.0" w:type="dxa"/>
+        <w:tblW w:w="9555.0" w:type="dxa"/>
         <w:jc w:val="left"/>
         <w:tblInd w:w="-108.0" w:type="dxa"/>
         <w:tblBorders>
@@ -346,18 +331,18 @@
         <w:tblLook w:val="0000"/>
       </w:tblPr>
       <w:tblGrid>
-        <w:gridCol w:w="1770"/>
-        <w:gridCol w:w="1755"/>
-        <w:gridCol w:w="1860"/>
+        <w:gridCol w:w="1695"/>
+        <w:gridCol w:w="2190"/>
+        <w:gridCol w:w="1500"/>
         <w:gridCol w:w="1440"/>
-        <w:gridCol w:w="1785"/>
+        <w:gridCol w:w="2730"/>
         <w:tblGridChange w:id="0">
           <w:tblGrid>
-            <w:gridCol w:w="1770"/>
-            <w:gridCol w:w="1755"/>
-            <w:gridCol w:w="1860"/>
+            <w:gridCol w:w="1695"/>
+            <w:gridCol w:w="2190"/>
+            <w:gridCol w:w="1500"/>
             <w:gridCol w:w="1440"/>
-            <w:gridCol w:w="1785"/>
+            <w:gridCol w:w="2730"/>
           </w:tblGrid>
         </w:tblGridChange>
       </w:tblGrid>
@@ -643,7 +628,7 @@
                 <w:szCs w:val="24"/>
                 <w:rtl w:val="0"/>
               </w:rPr>
-              <w:t xml:space="preserve">Every Friday </w:t>
+              <w:t xml:space="preserve">Every Thursday</w:t>
             </w:r>
           </w:p>
         </w:tc>
@@ -769,7 +754,7 @@
                 <w:szCs w:val="24"/>
                 <w:rtl w:val="0"/>
               </w:rPr>
-              <w:t xml:space="preserve">Every Friday </w:t>
+              <w:t xml:space="preserve">Every Thursday </w:t>
             </w:r>
           </w:p>
         </w:tc>
@@ -877,40 +862,6 @@
                 <w:rtl w:val="0"/>
               </w:rPr>
               <w:t xml:space="preserve">Andres Vasquez</w:t>
-            </w:r>
-          </w:p>
-          <w:p>
-            <w:pPr>
-              <w:spacing w:line="240" w:lineRule="auto"/>
-              <w:rPr>
-                <w:rFonts w:ascii="Times New Roman" w:cs="Times New Roman" w:eastAsia="Times New Roman" w:hAnsi="Times New Roman"/>
-                <w:sz w:val="24"/>
-                <w:szCs w:val="24"/>
-              </w:rPr>
-            </w:pPr>
-            <w:r>
-              <w:rPr>
-                <w:rFonts w:ascii="Times New Roman" w:cs="Times New Roman" w:eastAsia="Times New Roman" w:hAnsi="Times New Roman"/>
-                <w:sz w:val="24"/>
-                <w:szCs w:val="24"/>
-                <w:rtl w:val="0"/>
-              </w:rPr>
-              <w:t xml:space="preserve">(Group Members)</w:t>
-            </w:r>
-          </w:p>
-          <w:p>
-            <w:pPr>
-              <w:spacing w:line="240" w:lineRule="auto"/>
-              <w:rPr>
-                <w:rFonts w:ascii="Times New Roman" w:cs="Times New Roman" w:eastAsia="Times New Roman" w:hAnsi="Times New Roman"/>
-                <w:sz w:val="24"/>
-                <w:szCs w:val="24"/>
-              </w:rPr>
-            </w:pPr>
-            <w:r>
-              <w:rPr>
-                <w:rtl w:val="0"/>
-              </w:rPr>
             </w:r>
           </w:p>
         </w:tc>

</xml_diff>